<commit_message>
regen codebook docx with v5 kenya validation + sentiment/emotion/tone sections
</commit_message>
<xml_diff>
--- a/Codebooks/LLM Codebook/Nigeria Manfluencer Project - Final Coding Codebook.docx
+++ b/Codebooks/LLM Codebook/Nigeria Manfluencer Project - Final Coding Codebook.docx
@@ -3734,7 +3734,7 @@
         <w:pStyle w:val="Heading2"/>
       </w:pPr>
       <w:r>
-        <w:t>7.2 Normative Orientation</w:t>
+        <w:t>7.2 Sentiment</w:t>
       </w:r>
     </w:p>
     <w:p>
@@ -3747,7 +3747,7 @@
           <w:i/>
           <w:sz w:val="20"/>
         </w:rPr>
-        <w:t>Scope: Both audience and content</w:t>
+        <w:t>Scope: Both audience and content (matches human codebook Q1)</w:t>
       </w:r>
     </w:p>
     <w:p>
@@ -3773,7 +3773,7 @@
           <w:i w:val="0"/>
           <w:sz w:val="22"/>
         </w:rPr>
-        <w:t>Whether the text reinforces hierarchy / misogyny, challenges it, combines both, or is unclear.</w:t>
+        <w:t>The overall valence of the text. Captures whether the comment expresses a positive, negative, or neutral disposition. Unclear is reserved for cases where valence cannot be determined (e.g., rhetorical questions or fragmentary text).</w:t>
       </w:r>
     </w:p>
     <w:p>
@@ -3794,7 +3794,7 @@
         <w:pStyle w:val="ListBullet"/>
       </w:pPr>
       <w:r>
-        <w:t>Progressive — challenges hierarchy or supports equality</w:t>
+        <w:t>Positive</w:t>
       </w:r>
     </w:p>
     <w:p>
@@ -3802,7 +3802,7 @@
         <w:pStyle w:val="ListBullet"/>
       </w:pPr>
       <w:r>
-        <w:t>Regressive — reinforces hierarchy or traditional roles</w:t>
+        <w:t>Negative</w:t>
       </w:r>
     </w:p>
     <w:p>
@@ -3810,7 +3810,7 @@
         <w:pStyle w:val="ListBullet"/>
       </w:pPr>
       <w:r>
-        <w:t>Mixed — both elements present</w:t>
+        <w:t>Neutral</w:t>
       </w:r>
     </w:p>
     <w:p>
@@ -3818,7 +3818,7 @@
         <w:pStyle w:val="ListBullet"/>
       </w:pPr>
       <w:r>
-        <w:t>Unclear — cannot determine</w:t>
+        <w:t>Unclear</w:t>
       </w:r>
     </w:p>
     <w:p>
@@ -3844,7 +3844,7 @@
           <w:i w:val="0"/>
           <w:sz w:val="22"/>
         </w:rPr>
-        <w:t>Separates topic from position. The same theme can appear in both progressive and regressive forms — Marriage and Family is the clearest example. This dimension makes the cross-tab coherent.</w:t>
+        <w:t>Mirrors the human audience codebook Q1 vocabulary so that LLM-coded sentiment is directly comparable to human-coded sentiment for inter-rater reliability checks. Earlier 4-class schemes that included a Mixed category were dropped because they produced low-precision splits and were not usable for the prior project's standard reporting.</w:t>
       </w:r>
     </w:p>
     <w:p>
@@ -3852,7 +3852,7 @@
         <w:pStyle w:val="Heading2"/>
       </w:pPr>
       <w:r>
-        <w:t>7.3 Rhetorical Strategy</w:t>
+        <w:t>7.3 Emotion Detection</w:t>
       </w:r>
     </w:p>
     <w:p>
@@ -3865,7 +3865,7 @@
           <w:i/>
           <w:sz w:val="20"/>
         </w:rPr>
-        <w:t>Scope: Both audience and content</w:t>
+        <w:t>Scope: Both audience and content (mirrors human codebook Q2 vocabulary)</w:t>
       </w:r>
     </w:p>
     <w:p>
@@ -3891,7 +3891,7 @@
           <w:i w:val="0"/>
           <w:sz w:val="22"/>
         </w:rPr>
-        <w:t>How the message persuades, not only what it says.</w:t>
+        <w:t>The dominant discrete emotion expressed by the commenter or speaker. Built directly from the human codebook's Q2 'Primary emotional tone' option list to keep LLM-coded emotion comparable to human-coded emotion.</w:t>
       </w:r>
     </w:p>
     <w:p>
@@ -3912,7 +3912,7 @@
         <w:pStyle w:val="ListBullet"/>
       </w:pPr>
       <w:r>
-        <w:t>Advice / Rule — prescriptive ('you should…')</w:t>
+        <w:t>Joy</w:t>
       </w:r>
     </w:p>
     <w:p>
@@ -3920,7 +3920,7 @@
         <w:pStyle w:val="ListBullet"/>
       </w:pPr>
       <w:r>
-        <w:t>Testimony — first-person personal experience</w:t>
+        <w:t>Happiness</w:t>
       </w:r>
     </w:p>
     <w:p>
@@ -3928,7 +3928,7 @@
         <w:pStyle w:val="ListBullet"/>
       </w:pPr>
       <w:r>
-        <w:t>Moral Warning — 'this will end badly'</w:t>
+        <w:t>Surprise</w:t>
       </w:r>
     </w:p>
     <w:p>
@@ -3936,7 +3936,7 @@
         <w:pStyle w:val="ListBullet"/>
       </w:pPr>
       <w:r>
-        <w:t>Ridicule — mockery, sarcasm, dismissal</w:t>
+        <w:t>Anger</w:t>
       </w:r>
     </w:p>
     <w:p>
@@ -3944,7 +3944,7 @@
         <w:pStyle w:val="ListBullet"/>
       </w:pPr>
       <w:r>
-        <w:t>Religious Appeal — scripture or doctrine-based</w:t>
+        <w:t>Fear</w:t>
       </w:r>
     </w:p>
     <w:p>
@@ -3952,7 +3952,7 @@
         <w:pStyle w:val="ListBullet"/>
       </w:pPr>
       <w:r>
-        <w:t>Whataboutism — deflection ('but what about X?')</w:t>
+        <w:t>Contempt</w:t>
       </w:r>
     </w:p>
     <w:p>
@@ -3960,7 +3960,7 @@
         <w:pStyle w:val="ListBullet"/>
       </w:pPr>
       <w:r>
-        <w:t>Common-Sense Claim — 'everyone knows…', 'it's just reality'</w:t>
+        <w:t>Sadness</w:t>
       </w:r>
     </w:p>
     <w:p>
@@ -3968,7 +3968,23 @@
         <w:pStyle w:val="ListBullet"/>
       </w:pPr>
       <w:r>
-        <w:t>Empathy and Solidarity — 'I see you / we stand with you'</w:t>
+        <w:t>Hope</w:t>
+      </w:r>
+    </w:p>
+    <w:p>
+      <w:pPr>
+        <w:pStyle w:val="ListBullet"/>
+      </w:pPr>
+      <w:r>
+        <w:t>Empathy</w:t>
+      </w:r>
+    </w:p>
+    <w:p>
+      <w:pPr>
+        <w:pStyle w:val="ListBullet"/>
+      </w:pPr>
+      <w:r>
+        <w:t>None of these</w:t>
       </w:r>
     </w:p>
     <w:p>
@@ -3994,7 +4010,7 @@
           <w:i w:val="0"/>
           <w:sz w:val="22"/>
         </w:rPr>
-        <w:t>Maps onto content codebook Q10 (communication mode) and Q13 (justification). Surfaces the rhetorical fingerprint of each creator and the patterns of audience uptake.</w:t>
+        <w:t>Q2 of the human codebook bundles 'emotion' and 'tone' into a single field labeled 'Primary emotional tone'. The final codebook splits these into two distinct dimensions: Emotion Detection captures what the commenter feels (this field), and Tone captures how the message is delivered (next field). Splitting these axes is supported by classical work in social-media discourse analysis, where emotion (psychological state) and tone (rhetorical register) consistently behave as separable dimensions. Emotion Detection retains the Q2 vocabulary verbatim so the LLM output can be cross-validated against any future human pass that uses Q2 directly.</w:t>
       </w:r>
     </w:p>
     <w:p>
@@ -4002,7 +4018,7 @@
         <w:pStyle w:val="Heading2"/>
       </w:pPr>
       <w:r>
-        <w:t>7.4 Target of Claim</w:t>
+        <w:t>7.4 Tone</w:t>
       </w:r>
     </w:p>
     <w:p>
@@ -4015,7 +4031,7 @@
           <w:i/>
           <w:sz w:val="20"/>
         </w:rPr>
-        <w:t>Scope: Both audience and content</w:t>
+        <w:t>Scope: Both audience and content (NEW dimension; not directly in human codebook)</w:t>
       </w:r>
     </w:p>
     <w:p>
@@ -4041,7 +4057,7 @@
           <w:i w:val="0"/>
           <w:sz w:val="22"/>
         </w:rPr>
-        <w:t>Who or what the claim is directed at — the object of the speech act.</w:t>
+        <w:t>The rhetorical register of the comment — how the message is delivered, distinct from what the speaker feels. Captures stylistic posture toward the topic and the audience.</w:t>
       </w:r>
     </w:p>
     <w:p>
@@ -4062,7 +4078,7 @@
         <w:pStyle w:val="ListBullet"/>
       </w:pPr>
       <w:r>
-        <w:t>Men / boys</w:t>
+        <w:t>Earnest — sincere, direct, no irony</w:t>
       </w:r>
     </w:p>
     <w:p>
@@ -4070,7 +4086,7 @@
         <w:pStyle w:val="ListBullet"/>
       </w:pPr>
       <w:r>
-        <w:t>Women / girls</w:t>
+        <w:t>Sarcastic — ironic, mocking, opposite-meaning</w:t>
       </w:r>
     </w:p>
     <w:p>
@@ -4078,7 +4094,7 @@
         <w:pStyle w:val="ListBullet"/>
       </w:pPr>
       <w:r>
-        <w:t>Wives / girlfriends</w:t>
+        <w:t>Hostile — aggressive, attacking, confrontational</w:t>
       </w:r>
     </w:p>
     <w:p>
@@ -4086,7 +4102,7 @@
         <w:pStyle w:val="ListBullet"/>
       </w:pPr>
       <w:r>
-        <w:t>Husbands / boyfriends</w:t>
+        <w:t>Humorous — playful, joking, light-hearted</w:t>
       </w:r>
     </w:p>
     <w:p>
@@ -4094,7 +4110,7 @@
         <w:pStyle w:val="ListBullet"/>
       </w:pPr>
       <w:r>
-        <w:t>Feminists / modern women</w:t>
+        <w:t>Empathetic — supportive, compassionate, validating</w:t>
       </w:r>
     </w:p>
     <w:p>
@@ -4102,7 +4118,7 @@
         <w:pStyle w:val="ListBullet"/>
       </w:pPr>
       <w:r>
-        <w:t>Children / family</w:t>
+        <w:t>Authoritative — didactic, prescriptive, lecturing</w:t>
       </w:r>
     </w:p>
     <w:p>
@@ -4110,23 +4126,7 @@
         <w:pStyle w:val="ListBullet"/>
       </w:pPr>
       <w:r>
-        <w:t>Institutions / law / society</w:t>
-      </w:r>
-    </w:p>
-    <w:p>
-      <w:pPr>
-        <w:pStyle w:val="ListBullet"/>
-      </w:pPr>
-      <w:r>
-        <w:t>Self / personal life</w:t>
-      </w:r>
-    </w:p>
-    <w:p>
-      <w:pPr>
-        <w:pStyle w:val="ListBullet"/>
-      </w:pPr>
-      <w:r>
-        <w:t>Mixed / unclear</w:t>
+        <w:t>Detached — neutral, observational, distant</w:t>
       </w:r>
     </w:p>
     <w:p>
@@ -4152,20 +4152,46 @@
           <w:i w:val="0"/>
           <w:sz w:val="22"/>
         </w:rPr>
-        <w:t>Disambiguates attacks-on-women from advice-to-men from defending-victims from personal narrative — distinctions that any single theme code cannot capture alone.</w:t>
-      </w:r>
-    </w:p>
-    <w:p>
-      <w:pPr>
-        <w:pStyle w:val="Heading1"/>
-      </w:pPr>
-      <w:r>
-        <w:t>8. Coding schemas by track</w:t>
+        <w:t>Tone is not separately captured anywhere in the human audience or content codebook — Q2 conflates emotion and tone. This is a meaningful gap: a comment expressing the emotion 'Anger' could be delivered in an earnest register, a sarcastic register, or a hostile register, and these distinctions matter substantively for the playbook (e.g., distinguishing sincere male-accountability advocacy from sarcastic deflection). The seven values are drawn from established discourse-analytic categories (Pennebaker LIWC analytical/casual axis; Berger 2014 marketing-tone framework; classical pragmatics on register). The list is deliberately compact (seven mutually exclusive categories) so the LLM and any future human coder can apply it consistently. Tone allows the analysis to separate, for example, an earnest Gender-Based Violence and Consent reply from a hostile one within the same theme bucket.</w:t>
+      </w:r>
+    </w:p>
+    <w:p>
+      <w:pPr>
+        <w:pStyle w:val="Heading2"/>
+      </w:pPr>
+      <w:r>
+        <w:t>7.5 Normative Orientation</w:t>
       </w:r>
     </w:p>
     <w:p>
       <w:pPr>
         <w:spacing w:after="120"/>
+      </w:pPr>
+      <w:r>
+        <w:rPr>
+          <w:b w:val="0"/>
+          <w:i/>
+          <w:sz w:val="20"/>
+        </w:rPr>
+        <w:t>Scope: Both audience and content</w:t>
+      </w:r>
+    </w:p>
+    <w:p>
+      <w:pPr>
+        <w:spacing w:after="40"/>
+      </w:pPr>
+      <w:r>
+        <w:rPr>
+          <w:b/>
+          <w:i w:val="0"/>
+          <w:sz w:val="22"/>
+        </w:rPr>
+        <w:t>Definition</w:t>
+      </w:r>
+    </w:p>
+    <w:p>
+      <w:pPr>
+        <w:spacing w:after="160"/>
       </w:pPr>
       <w:r>
         <w:rPr>
@@ -4173,12 +4199,12 @@
           <w:i w:val="0"/>
           <w:sz w:val="22"/>
         </w:rPr>
-        <w:t>Both tracks share the 13 primary themes, the Unclear meta code, and the Masculinity Identity scope marker. They differ only in the auxiliary set.</w:t>
-      </w:r>
-    </w:p>
-    <w:p>
-      <w:pPr>
-        <w:spacing w:after="120"/>
+        <w:t>Whether the text reinforces hierarchy / misogyny, challenges it, combines both, or is unclear.</w:t>
+      </w:r>
+    </w:p>
+    <w:p>
+      <w:pPr>
+        <w:spacing w:after="40"/>
       </w:pPr>
       <w:r>
         <w:rPr>
@@ -4186,7 +4212,7 @@
           <w:i w:val="0"/>
           <w:sz w:val="22"/>
         </w:rPr>
-        <w:t>Audience analysis schema (8 fields per row)</w:t>
+        <w:t>Values</w:t>
       </w:r>
     </w:p>
     <w:p>
@@ -4194,7 +4220,7 @@
         <w:pStyle w:val="ListBullet"/>
       </w:pPr>
       <w:r>
-        <w:t>Primary Theme — one of the 13 themes or Unclear</w:t>
+        <w:t>Progressive — challenges hierarchy or supports equality</w:t>
       </w:r>
     </w:p>
     <w:p>
@@ -4202,7 +4228,7 @@
         <w:pStyle w:val="ListBullet"/>
       </w:pPr>
       <w:r>
-        <w:t>Secondary Theme 1 — one of the 13 themes or blank</w:t>
+        <w:t>Regressive — reinforces hierarchy or traditional roles</w:t>
       </w:r>
     </w:p>
     <w:p>
@@ -4210,7 +4236,7 @@
         <w:pStyle w:val="ListBullet"/>
       </w:pPr>
       <w:r>
-        <w:t>Secondary Theme 2 — one of the 13 themes or blank</w:t>
+        <w:t>Mixed — both elements present</w:t>
       </w:r>
     </w:p>
     <w:p>
@@ -4218,44 +4244,12 @@
         <w:pStyle w:val="ListBullet"/>
       </w:pPr>
       <w:r>
-        <w:t>Masculinity Identity — TRUE / FALSE</w:t>
-      </w:r>
-    </w:p>
-    <w:p>
-      <w:pPr>
-        <w:pStyle w:val="ListBullet"/>
-      </w:pPr>
-      <w:r>
-        <w:t>Audience Stance — Support / Challenge / Mixed / Question / Testimony / Joke-casual</w:t>
-      </w:r>
-    </w:p>
-    <w:p>
-      <w:pPr>
-        <w:pStyle w:val="ListBullet"/>
-      </w:pPr>
-      <w:r>
-        <w:t>Normative Orientation — Progressive / Regressive / Mixed / Unclear</w:t>
-      </w:r>
-    </w:p>
-    <w:p>
-      <w:pPr>
-        <w:pStyle w:val="ListBullet"/>
-      </w:pPr>
-      <w:r>
-        <w:t>Rhetorical Strategy — one of eight</w:t>
-      </w:r>
-    </w:p>
-    <w:p>
-      <w:pPr>
-        <w:pStyle w:val="ListBullet"/>
-      </w:pPr>
-      <w:r>
-        <w:t>Target of Claim — one of nine</w:t>
-      </w:r>
-    </w:p>
-    <w:p>
-      <w:pPr>
-        <w:spacing w:after="120"/>
+        <w:t>Unclear — cannot determine</w:t>
+      </w:r>
+    </w:p>
+    <w:p>
+      <w:pPr>
+        <w:spacing w:after="40"/>
       </w:pPr>
       <w:r>
         <w:rPr>
@@ -4263,76 +4257,12 @@
           <w:i w:val="0"/>
           <w:sz w:val="22"/>
         </w:rPr>
-        <w:t>Content analysis schema (7 fields per row)</w:t>
-      </w:r>
-    </w:p>
-    <w:p>
-      <w:pPr>
-        <w:pStyle w:val="ListBullet"/>
-      </w:pPr>
-      <w:r>
-        <w:t>Primary Theme — one of the 13 themes or Unclear</w:t>
-      </w:r>
-    </w:p>
-    <w:p>
-      <w:pPr>
-        <w:pStyle w:val="ListBullet"/>
-      </w:pPr>
-      <w:r>
-        <w:t>Secondary Theme 1 — one of the 13 themes or blank</w:t>
-      </w:r>
-    </w:p>
-    <w:p>
-      <w:pPr>
-        <w:pStyle w:val="ListBullet"/>
-      </w:pPr>
-      <w:r>
-        <w:t>Secondary Theme 2 — one of the 13 themes or blank</w:t>
-      </w:r>
-    </w:p>
-    <w:p>
-      <w:pPr>
-        <w:pStyle w:val="ListBullet"/>
-      </w:pPr>
-      <w:r>
-        <w:t>Masculinity Identity — TRUE / FALSE</w:t>
-      </w:r>
-    </w:p>
-    <w:p>
-      <w:pPr>
-        <w:pStyle w:val="ListBullet"/>
-      </w:pPr>
-      <w:r>
-        <w:t>Normative Orientation — Progressive / Regressive / Mixed / Unclear</w:t>
-      </w:r>
-    </w:p>
-    <w:p>
-      <w:pPr>
-        <w:pStyle w:val="ListBullet"/>
-      </w:pPr>
-      <w:r>
-        <w:t>Rhetorical Strategy — one of eight</w:t>
-      </w:r>
-    </w:p>
-    <w:p>
-      <w:pPr>
-        <w:pStyle w:val="ListBullet"/>
-      </w:pPr>
-      <w:r>
-        <w:t>Target of Claim — one of nine</w:t>
-      </w:r>
-    </w:p>
-    <w:p>
-      <w:pPr>
-        <w:pStyle w:val="Heading1"/>
-      </w:pPr>
-      <w:r>
-        <w:t>9. Disambiguation rules</w:t>
-      </w:r>
-    </w:p>
-    <w:p>
-      <w:pPr>
-        <w:spacing w:after="120"/>
+        <w:t>Why this field is included</w:t>
+      </w:r>
+    </w:p>
+    <w:p>
+      <w:pPr>
+        <w:spacing w:after="240"/>
       </w:pPr>
       <w:r>
         <w:rPr>
@@ -4340,7 +4270,28 @@
           <w:i w:val="0"/>
           <w:sz w:val="22"/>
         </w:rPr>
-        <w:t>The themes overlap in places. The following rules govern primary-theme assignment when more than one code seems to fit. These rules are listed in order of priority — the first applicable rule wins.</w:t>
+        <w:t>Separates topic from position. The same theme can appear in both progressive and regressive forms — Marriage and Family is the clearest example. This dimension makes the cross-tab coherent.</w:t>
+      </w:r>
+    </w:p>
+    <w:p>
+      <w:pPr>
+        <w:pStyle w:val="Heading2"/>
+      </w:pPr>
+      <w:r>
+        <w:t>7.6 Rhetorical Strategy</w:t>
+      </w:r>
+    </w:p>
+    <w:p>
+      <w:pPr>
+        <w:spacing w:after="120"/>
+      </w:pPr>
+      <w:r>
+        <w:rPr>
+          <w:b w:val="0"/>
+          <w:i/>
+          <w:sz w:val="20"/>
+        </w:rPr>
+        <w:t>Scope: Both audience and content</w:t>
       </w:r>
     </w:p>
     <w:p>
@@ -4353,7 +4304,7 @@
           <w:i w:val="0"/>
           <w:sz w:val="22"/>
         </w:rPr>
-        <w:t>Violence trumps morality.</w:t>
+        <w:t>Definition</w:t>
       </w:r>
     </w:p>
     <w:p>
@@ -4366,7 +4317,7 @@
           <w:i w:val="0"/>
           <w:sz w:val="22"/>
         </w:rPr>
-        <w:t>If rape, consent, abuse, or victim/accuser framing is in scope, code Gender-Based Violence and Consent — even if sexual morality language is also present.</w:t>
+        <w:t>How the message persuades, not only what it says.</w:t>
       </w:r>
     </w:p>
     <w:p>
@@ -4379,12 +4330,89 @@
           <w:i w:val="0"/>
           <w:sz w:val="22"/>
         </w:rPr>
-        <w:t>Hierarchy trumps family.</w:t>
-      </w:r>
-    </w:p>
-    <w:p>
-      <w:pPr>
-        <w:spacing w:after="160"/>
+        <w:t>Values</w:t>
+      </w:r>
+    </w:p>
+    <w:p>
+      <w:pPr>
+        <w:pStyle w:val="ListBullet"/>
+      </w:pPr>
+      <w:r>
+        <w:t>Advice / Rule — prescriptive ('you should…')</w:t>
+      </w:r>
+    </w:p>
+    <w:p>
+      <w:pPr>
+        <w:pStyle w:val="ListBullet"/>
+      </w:pPr>
+      <w:r>
+        <w:t>Testimony — first-person personal experience</w:t>
+      </w:r>
+    </w:p>
+    <w:p>
+      <w:pPr>
+        <w:pStyle w:val="ListBullet"/>
+      </w:pPr>
+      <w:r>
+        <w:t>Moral Warning — 'this will end badly'</w:t>
+      </w:r>
+    </w:p>
+    <w:p>
+      <w:pPr>
+        <w:pStyle w:val="ListBullet"/>
+      </w:pPr>
+      <w:r>
+        <w:t>Ridicule — mockery, sarcasm, dismissal</w:t>
+      </w:r>
+    </w:p>
+    <w:p>
+      <w:pPr>
+        <w:pStyle w:val="ListBullet"/>
+      </w:pPr>
+      <w:r>
+        <w:t>Religious Appeal — scripture or doctrine-based</w:t>
+      </w:r>
+    </w:p>
+    <w:p>
+      <w:pPr>
+        <w:pStyle w:val="ListBullet"/>
+      </w:pPr>
+      <w:r>
+        <w:t>Whataboutism — deflection ('but what about X?')</w:t>
+      </w:r>
+    </w:p>
+    <w:p>
+      <w:pPr>
+        <w:pStyle w:val="ListBullet"/>
+      </w:pPr>
+      <w:r>
+        <w:t>Common-Sense Claim — 'everyone knows…', 'it's just reality'</w:t>
+      </w:r>
+    </w:p>
+    <w:p>
+      <w:pPr>
+        <w:pStyle w:val="ListBullet"/>
+      </w:pPr>
+      <w:r>
+        <w:t>Empathy and Solidarity — 'I see you / we stand with you'</w:t>
+      </w:r>
+    </w:p>
+    <w:p>
+      <w:pPr>
+        <w:spacing w:after="40"/>
+      </w:pPr>
+      <w:r>
+        <w:rPr>
+          <w:b/>
+          <w:i w:val="0"/>
+          <w:sz w:val="22"/>
+        </w:rPr>
+        <w:t>Why this field is included</w:t>
+      </w:r>
+    </w:p>
+    <w:p>
+      <w:pPr>
+        <w:spacing w:after="240"/>
       </w:pPr>
       <w:r>
         <w:rPr>
@@ -4392,7 +4420,28 @@
           <w:i w:val="0"/>
           <w:sz w:val="22"/>
         </w:rPr>
-        <w:t>If the text endorses, debates, or challenges hierarchy between men and women, code Authority and Submission — even if marriage is the setting.</w:t>
+        <w:t>Maps onto content codebook Q10 (communication mode) and Q13 (justification). Surfaces the rhetorical fingerprint of each creator and the patterns of audience uptake.</w:t>
+      </w:r>
+    </w:p>
+    <w:p>
+      <w:pPr>
+        <w:pStyle w:val="Heading2"/>
+      </w:pPr>
+      <w:r>
+        <w:t>7.7 Target of Claim</w:t>
+      </w:r>
+    </w:p>
+    <w:p>
+      <w:pPr>
+        <w:spacing w:after="120"/>
+      </w:pPr>
+      <w:r>
+        <w:rPr>
+          <w:b w:val="0"/>
+          <w:i/>
+          <w:sz w:val="20"/>
+        </w:rPr>
+        <w:t>Scope: Both audience and content</w:t>
       </w:r>
     </w:p>
     <w:p>
@@ -4405,7 +4454,7 @@
           <w:i w:val="0"/>
           <w:sz w:val="22"/>
         </w:rPr>
-        <w:t>Specificity trumps Marriage and Family.</w:t>
+        <w:t>Definition</w:t>
       </w:r>
     </w:p>
     <w:p>
@@ -4418,7 +4467,7 @@
           <w:i w:val="0"/>
           <w:sz w:val="22"/>
         </w:rPr>
-        <w:t>Marriage and Family is the most over-applied default. Use it only when the institution itself is the central topic. If the row is really about submission, sexual double standards, or partnership norms, use the more specific code.</w:t>
+        <w:t>Who or what the claim is directed at — the object of the speech act.</w:t>
       </w:r>
     </w:p>
     <w:p>
@@ -4431,12 +4480,97 @@
           <w:i w:val="0"/>
           <w:sz w:val="22"/>
         </w:rPr>
-        <w:t>Specificity trumps Masculinity Identity.</w:t>
-      </w:r>
-    </w:p>
-    <w:p>
-      <w:pPr>
-        <w:spacing w:after="160"/>
+        <w:t>Values</w:t>
+      </w:r>
+    </w:p>
+    <w:p>
+      <w:pPr>
+        <w:pStyle w:val="ListBullet"/>
+      </w:pPr>
+      <w:r>
+        <w:t>Men / boys</w:t>
+      </w:r>
+    </w:p>
+    <w:p>
+      <w:pPr>
+        <w:pStyle w:val="ListBullet"/>
+      </w:pPr>
+      <w:r>
+        <w:t>Women / girls</w:t>
+      </w:r>
+    </w:p>
+    <w:p>
+      <w:pPr>
+        <w:pStyle w:val="ListBullet"/>
+      </w:pPr>
+      <w:r>
+        <w:t>Wives / girlfriends</w:t>
+      </w:r>
+    </w:p>
+    <w:p>
+      <w:pPr>
+        <w:pStyle w:val="ListBullet"/>
+      </w:pPr>
+      <w:r>
+        <w:t>Husbands / boyfriends</w:t>
+      </w:r>
+    </w:p>
+    <w:p>
+      <w:pPr>
+        <w:pStyle w:val="ListBullet"/>
+      </w:pPr>
+      <w:r>
+        <w:t>Feminists / modern women</w:t>
+      </w:r>
+    </w:p>
+    <w:p>
+      <w:pPr>
+        <w:pStyle w:val="ListBullet"/>
+      </w:pPr>
+      <w:r>
+        <w:t>Children / family</w:t>
+      </w:r>
+    </w:p>
+    <w:p>
+      <w:pPr>
+        <w:pStyle w:val="ListBullet"/>
+      </w:pPr>
+      <w:r>
+        <w:t>Institutions / law / society</w:t>
+      </w:r>
+    </w:p>
+    <w:p>
+      <w:pPr>
+        <w:pStyle w:val="ListBullet"/>
+      </w:pPr>
+      <w:r>
+        <w:t>Self / personal life</w:t>
+      </w:r>
+    </w:p>
+    <w:p>
+      <w:pPr>
+        <w:pStyle w:val="ListBullet"/>
+      </w:pPr>
+      <w:r>
+        <w:t>Mixed / unclear</w:t>
+      </w:r>
+    </w:p>
+    <w:p>
+      <w:pPr>
+        <w:spacing w:after="40"/>
+      </w:pPr>
+      <w:r>
+        <w:rPr>
+          <w:b/>
+          <w:i w:val="0"/>
+          <w:sz w:val="22"/>
+        </w:rPr>
+        <w:t>Why this field is included</w:t>
+      </w:r>
+    </w:p>
+    <w:p>
+      <w:pPr>
+        <w:spacing w:after="240"/>
       </w:pPr>
       <w:r>
         <w:rPr>
@@ -4444,12 +4578,33 @@
           <w:i w:val="0"/>
           <w:sz w:val="22"/>
         </w:rPr>
-        <w:t>Masculinity Identity is a scope marker. Set it TRUE alongside any specific theme. Never use it as primary.</w:t>
-      </w:r>
-    </w:p>
-    <w:p>
-      <w:pPr>
-        <w:spacing w:after="40"/>
+        <w:t>Disambiguates attacks-on-women from advice-to-men from defending-victims from personal narrative — distinctions that any single theme code cannot capture alone.</w:t>
+      </w:r>
+    </w:p>
+    <w:p>
+      <w:pPr>
+        <w:pStyle w:val="Heading1"/>
+      </w:pPr>
+      <w:r>
+        <w:t>8. Coding schemas by track</w:t>
+      </w:r>
+    </w:p>
+    <w:p>
+      <w:pPr>
+        <w:spacing w:after="120"/>
+      </w:pPr>
+      <w:r>
+        <w:rPr>
+          <w:b w:val="0"/>
+          <w:i w:val="0"/>
+          <w:sz w:val="22"/>
+        </w:rPr>
+        <w:t>Both tracks share the 13 primary themes, the Unclear meta code, and the Masculinity Identity scope marker. They differ only in the auxiliary set.</w:t>
+      </w:r>
+    </w:p>
+    <w:p>
+      <w:pPr>
+        <w:spacing w:after="120"/>
       </w:pPr>
       <w:r>
         <w:rPr>
@@ -4457,7 +4612,201 @@
           <w:i w:val="0"/>
           <w:sz w:val="22"/>
         </w:rPr>
-        <w:t>Strict gating on Faith and Moral Repair.</w:t>
+        <w:t>Audience analysis schema (11 fields per row)</w:t>
+      </w:r>
+    </w:p>
+    <w:p>
+      <w:pPr>
+        <w:pStyle w:val="ListBullet"/>
+      </w:pPr>
+      <w:r>
+        <w:t>Primary Theme — one of the 13 themes or Unclear</w:t>
+      </w:r>
+    </w:p>
+    <w:p>
+      <w:pPr>
+        <w:pStyle w:val="ListBullet"/>
+      </w:pPr>
+      <w:r>
+        <w:t>Secondary Theme 1 — one of the 13 themes or blank</w:t>
+      </w:r>
+    </w:p>
+    <w:p>
+      <w:pPr>
+        <w:pStyle w:val="ListBullet"/>
+      </w:pPr>
+      <w:r>
+        <w:t>Secondary Theme 2 — one of the 13 themes or blank</w:t>
+      </w:r>
+    </w:p>
+    <w:p>
+      <w:pPr>
+        <w:pStyle w:val="ListBullet"/>
+      </w:pPr>
+      <w:r>
+        <w:t>Masculinity Identity — TRUE / FALSE</w:t>
+      </w:r>
+    </w:p>
+    <w:p>
+      <w:pPr>
+        <w:pStyle w:val="ListBullet"/>
+      </w:pPr>
+      <w:r>
+        <w:t>Sentiment — Positive / Negative / Neutral / Unclear</w:t>
+      </w:r>
+    </w:p>
+    <w:p>
+      <w:pPr>
+        <w:pStyle w:val="ListBullet"/>
+      </w:pPr>
+      <w:r>
+        <w:t>Emotion Detection — one of ten emotion values (Joy, Happiness, Surprise, Anger, Fear, Contempt, Sadness, Hope, Empathy, None of these)</w:t>
+      </w:r>
+    </w:p>
+    <w:p>
+      <w:pPr>
+        <w:pStyle w:val="ListBullet"/>
+      </w:pPr>
+      <w:r>
+        <w:t>Tone — Earnest / Sarcastic / Hostile / Humorous / Empathetic / Authoritative / Detached</w:t>
+      </w:r>
+    </w:p>
+    <w:p>
+      <w:pPr>
+        <w:pStyle w:val="ListBullet"/>
+      </w:pPr>
+      <w:r>
+        <w:t>Audience Stance — Support / Challenge / Mixed / Question / Testimony / Joke-casual</w:t>
+      </w:r>
+    </w:p>
+    <w:p>
+      <w:pPr>
+        <w:pStyle w:val="ListBullet"/>
+      </w:pPr>
+      <w:r>
+        <w:t>Normative Orientation — Progressive / Regressive / Mixed / Unclear</w:t>
+      </w:r>
+    </w:p>
+    <w:p>
+      <w:pPr>
+        <w:pStyle w:val="ListBullet"/>
+      </w:pPr>
+      <w:r>
+        <w:t>Rhetorical Strategy — one of eight</w:t>
+      </w:r>
+    </w:p>
+    <w:p>
+      <w:pPr>
+        <w:pStyle w:val="ListBullet"/>
+      </w:pPr>
+      <w:r>
+        <w:t>Target of Claim — one of nine</w:t>
+      </w:r>
+    </w:p>
+    <w:p>
+      <w:pPr>
+        <w:spacing w:after="120"/>
+      </w:pPr>
+      <w:r>
+        <w:rPr>
+          <w:b/>
+          <w:i w:val="0"/>
+          <w:sz w:val="22"/>
+        </w:rPr>
+        <w:t>Content analysis schema (10 fields per row)</w:t>
+      </w:r>
+    </w:p>
+    <w:p>
+      <w:pPr>
+        <w:pStyle w:val="ListBullet"/>
+      </w:pPr>
+      <w:r>
+        <w:t>Primary Theme — one of the 13 themes or Unclear</w:t>
+      </w:r>
+    </w:p>
+    <w:p>
+      <w:pPr>
+        <w:pStyle w:val="ListBullet"/>
+      </w:pPr>
+      <w:r>
+        <w:t>Secondary Theme 1 — one of the 13 themes or blank</w:t>
+      </w:r>
+    </w:p>
+    <w:p>
+      <w:pPr>
+        <w:pStyle w:val="ListBullet"/>
+      </w:pPr>
+      <w:r>
+        <w:t>Secondary Theme 2 — one of the 13 themes or blank</w:t>
+      </w:r>
+    </w:p>
+    <w:p>
+      <w:pPr>
+        <w:pStyle w:val="ListBullet"/>
+      </w:pPr>
+      <w:r>
+        <w:t>Masculinity Identity — TRUE / FALSE</w:t>
+      </w:r>
+    </w:p>
+    <w:p>
+      <w:pPr>
+        <w:pStyle w:val="ListBullet"/>
+      </w:pPr>
+      <w:r>
+        <w:t>Sentiment — Positive / Negative / Neutral / Unclear</w:t>
+      </w:r>
+    </w:p>
+    <w:p>
+      <w:pPr>
+        <w:pStyle w:val="ListBullet"/>
+      </w:pPr>
+      <w:r>
+        <w:t>Emotion Detection — one of ten emotion values</w:t>
+      </w:r>
+    </w:p>
+    <w:p>
+      <w:pPr>
+        <w:pStyle w:val="ListBullet"/>
+      </w:pPr>
+      <w:r>
+        <w:t>Tone — Earnest / Sarcastic / Hostile / Humorous / Empathetic / Authoritative / Detached</w:t>
+      </w:r>
+    </w:p>
+    <w:p>
+      <w:pPr>
+        <w:pStyle w:val="ListBullet"/>
+      </w:pPr>
+      <w:r>
+        <w:t>Normative Orientation — Progressive / Regressive / Mixed / Unclear</w:t>
+      </w:r>
+    </w:p>
+    <w:p>
+      <w:pPr>
+        <w:pStyle w:val="ListBullet"/>
+      </w:pPr>
+      <w:r>
+        <w:t>Rhetorical Strategy — one of eight</w:t>
+      </w:r>
+    </w:p>
+    <w:p>
+      <w:pPr>
+        <w:pStyle w:val="ListBullet"/>
+      </w:pPr>
+      <w:r>
+        <w:t>Target of Claim — one of nine</w:t>
+      </w:r>
+    </w:p>
+    <w:p>
+      <w:pPr>
+        <w:spacing w:after="120"/>
+      </w:pPr>
+      <w:r>
+        <w:rPr>
+          <w:b/>
+          <w:i w:val="0"/>
+          <w:sz w:val="22"/>
+        </w:rPr>
+        <w:t>Operational LLM-coding schema (matches human codebook Q1–Q21h)</w:t>
       </w:r>
     </w:p>
     <w:p>
@@ -4470,7 +4819,28 @@
           <w:i w:val="0"/>
           <w:sz w:val="22"/>
         </w:rPr>
-        <w:t>Requires explicit faith / scripture / God / prayer / sin language. Generic moral judgment without a religious frame goes to a different theme.</w:t>
+        <w:t>When coding is performed by the LLM pipeline (notebook: 'LLM Coding Notebook - Audience Analysis.ipynb'), the output spreadsheet additionally carries every Q1 through Q21h column from the human audience codebook so that LLM and human coding can be compared field-by-field. The four front summary columns (Themes, Sentiment, Emotion Detection, Tone) are concise rollups of the same underlying judgments captured in Q1, Q2, and the theme list. Inter-rater reliability between the LLM and any future human pass should therefore be computed on the Q-numbered columns where vocabularies match exactly.</w:t>
+      </w:r>
+    </w:p>
+    <w:p>
+      <w:pPr>
+        <w:pStyle w:val="Heading1"/>
+      </w:pPr>
+      <w:r>
+        <w:t>9. Disambiguation rules</w:t>
+      </w:r>
+    </w:p>
+    <w:p>
+      <w:pPr>
+        <w:spacing w:after="120"/>
+      </w:pPr>
+      <w:r>
+        <w:rPr>
+          <w:b w:val="0"/>
+          <w:i w:val="0"/>
+          <w:sz w:val="22"/>
+        </w:rPr>
+        <w:t>The themes overlap in places. The following rules govern primary-theme assignment when more than one code seems to fit. These rules are listed in order of priority — the first applicable rule wins.</w:t>
       </w:r>
     </w:p>
     <w:p>
@@ -4483,7 +4853,7 @@
           <w:i w:val="0"/>
           <w:sz w:val="22"/>
         </w:rPr>
-        <w:t>Tactics versus values.</w:t>
+        <w:t>Violence trumps morality.</w:t>
       </w:r>
     </w:p>
     <w:p>
@@ -4496,7 +4866,7 @@
           <w:i w:val="0"/>
           <w:sz w:val="22"/>
         </w:rPr>
-        <w:t>Relationship Tactics requires tactical advice or strategy. Aspirational or values-based relationship talk goes to Egalitarian Partnership or Marriage and Family.</w:t>
+        <w:t>If rape, consent, abuse, or victim/accuser framing is in scope, code Gender-Based Violence and Consent — even if sexual morality language is also present.</w:t>
       </w:r>
     </w:p>
     <w:p>
@@ -4509,7 +4879,7 @@
           <w:i w:val="0"/>
           <w:sz w:val="22"/>
         </w:rPr>
-        <w:t>Grievance versus victimhood.</w:t>
+        <w:t>Hierarchy trumps family.</w:t>
       </w:r>
     </w:p>
     <w:p>
@@ -4522,7 +4892,7 @@
           <w:i w:val="0"/>
           <w:sz w:val="22"/>
         </w:rPr>
-        <w:t>Gender Grievance frames women / feminists as the threat. Male Victimhood frames men as the harmed party. Both can co-occur as primary plus secondary.</w:t>
+        <w:t>If the text endorses, debates, or challenges hierarchy between men and women, code Authority and Submission — even if marriage is the setting.</w:t>
       </w:r>
     </w:p>
     <w:p>
@@ -4535,7 +4905,7 @@
           <w:i w:val="0"/>
           <w:sz w:val="22"/>
         </w:rPr>
-        <w:t>Repression versus openness.</w:t>
+        <w:t>Specificity trumps Marriage and Family.</w:t>
       </w:r>
     </w:p>
     <w:p>
@@ -4548,15 +4918,7 @@
           <w:i w:val="0"/>
           <w:sz w:val="22"/>
         </w:rPr>
-        <w:t>Trauma and Mental Health captures the openness side of emotional discourse. The repression side ('men shouldn't show weakness') is captured by combining Trauma and Mental Health as primary with Normative Orientation = Regressive.</w:t>
-      </w:r>
-    </w:p>
-    <w:p>
-      <w:pPr>
-        <w:pStyle w:val="Heading1"/>
-      </w:pPr>
-      <w:r>
-        <w:t>10. Version history</w:t>
+        <w:t>Marriage and Family is the most over-applied default. Use it only when the institution itself is the central topic. If the row is really about submission, sexual double standards, or partnership norms, use the more specific code.</w:t>
       </w:r>
     </w:p>
     <w:p>
@@ -4569,7 +4931,7 @@
           <w:i w:val="0"/>
           <w:sz w:val="22"/>
         </w:rPr>
-        <w:t>v1 — Initial controlled vocabulary (April–May 2026)</w:t>
+        <w:t>Specificity trumps Masculinity Identity.</w:t>
       </w:r>
     </w:p>
     <w:p>
@@ -4582,7 +4944,7 @@
           <w:i w:val="0"/>
           <w:sz w:val="22"/>
         </w:rPr>
-        <w:t>15 codes derived directly from the project scope memo. Used in the first exploratory analysis pass on 417 audience and 310 content rows. Surfaced gaps around male victimhood and male accountability framing.</w:t>
+        <w:t>Masculinity Identity is a scope marker. Set it TRUE alongside any specific theme. Never use it as primary.</w:t>
       </w:r>
     </w:p>
     <w:p>
@@ -4595,7 +4957,7 @@
           <w:i w:val="0"/>
           <w:sz w:val="22"/>
         </w:rPr>
-        <w:t>v2 — 15-Pass Audit revision</w:t>
+        <w:t>Strict gating on Faith and Moral Repair.</w:t>
       </w:r>
     </w:p>
     <w:p>
@@ -4608,7 +4970,7 @@
           <w:i w:val="0"/>
           <w:sz w:val="22"/>
         </w:rPr>
-        <w:t>Independent ChatGPT audit of the v1 coded data flagged 21 OTHER assignments and three over-applied codes (FAITH, RELATIONSHIP_TACTICS, AUTHORITY_SUBMISSION). Reduced to 12 primary themes plus OTHER.</w:t>
+        <w:t>Requires explicit faith / scripture / God / prayer / sin language. Generic moral judgment without a religious frame goes to a different theme.</w:t>
       </w:r>
     </w:p>
     <w:p>
@@ -4621,7 +4983,7 @@
           <w:i w:val="0"/>
           <w:sz w:val="22"/>
         </w:rPr>
-        <w:t>v3 — Gap analysis revision</w:t>
+        <w:t>Tactics versus values.</w:t>
       </w:r>
     </w:p>
     <w:p>
@@ -4634,7 +4996,7 @@
           <w:i w:val="0"/>
           <w:sz w:val="22"/>
         </w:rPr>
-        <w:t>Cross-checked v2 against the human content and audience codebooks. Added Male Victimhood and Male Accountability as standalone themes (previously bundled into Gender Grievance and Gender-Based Violence and Consent respectively). Demoted Masculinity Identity from primary theme to scope marker. Added Target of Claim as a fourth auxiliary field. Replaced OTHER with Unclear and capped its usage at 5–7%.</w:t>
+        <w:t>Relationship Tactics requires tactical advice or strategy. Aspirational or values-based relationship talk goes to Egalitarian Partnership or Marriage and Family.</w:t>
       </w:r>
     </w:p>
     <w:p>
@@ -4647,7 +5009,7 @@
           <w:i w:val="0"/>
           <w:sz w:val="22"/>
         </w:rPr>
-        <w:t>v4 — Empirical re-validation (current)</w:t>
+        <w:t>Grievance versus victimhood.</w:t>
       </w:r>
     </w:p>
     <w:p>
@@ -4660,7 +5022,171 @@
           <w:i w:val="0"/>
           <w:sz w:val="22"/>
         </w:rPr>
+        <w:t>Gender Grievance frames women / feminists as the threat. Male Victimhood frames men as the harmed party. Both can co-occur as primary plus secondary.</w:t>
+      </w:r>
+    </w:p>
+    <w:p>
+      <w:pPr>
+        <w:spacing w:after="40"/>
+      </w:pPr>
+      <w:r>
+        <w:rPr>
+          <w:b/>
+          <w:i w:val="0"/>
+          <w:sz w:val="22"/>
+        </w:rPr>
+        <w:t>Repression versus openness.</w:t>
+      </w:r>
+    </w:p>
+    <w:p>
+      <w:pPr>
+        <w:spacing w:after="160"/>
+      </w:pPr>
+      <w:r>
+        <w:rPr>
+          <w:b w:val="0"/>
+          <w:i w:val="0"/>
+          <w:sz w:val="22"/>
+        </w:rPr>
+        <w:t>Trauma and Mental Health captures the openness side of emotional discourse. The repression side ('men shouldn't show weakness') is captured by combining Trauma and Mental Health as primary with Normative Orientation = Regressive.</w:t>
+      </w:r>
+    </w:p>
+    <w:p>
+      <w:pPr>
+        <w:pStyle w:val="Heading1"/>
+      </w:pPr>
+      <w:r>
+        <w:t>10. Version history</w:t>
+      </w:r>
+    </w:p>
+    <w:p>
+      <w:pPr>
+        <w:spacing w:after="40"/>
+      </w:pPr>
+      <w:r>
+        <w:rPr>
+          <w:b/>
+          <w:i w:val="0"/>
+          <w:sz w:val="22"/>
+        </w:rPr>
+        <w:t>v1 — Initial controlled vocabulary (April–May 2026)</w:t>
+      </w:r>
+    </w:p>
+    <w:p>
+      <w:pPr>
+        <w:spacing w:after="160"/>
+      </w:pPr>
+      <w:r>
+        <w:rPr>
+          <w:b w:val="0"/>
+          <w:i w:val="0"/>
+          <w:sz w:val="22"/>
+        </w:rPr>
+        <w:t>15 codes derived directly from the project scope memo. Used in the first exploratory analysis pass on 417 audience and 310 content rows. Surfaced gaps around male victimhood and male accountability framing.</w:t>
+      </w:r>
+    </w:p>
+    <w:p>
+      <w:pPr>
+        <w:spacing w:after="40"/>
+      </w:pPr>
+      <w:r>
+        <w:rPr>
+          <w:b/>
+          <w:i w:val="0"/>
+          <w:sz w:val="22"/>
+        </w:rPr>
+        <w:t>v2 — 15-Pass Audit revision</w:t>
+      </w:r>
+    </w:p>
+    <w:p>
+      <w:pPr>
+        <w:spacing w:after="160"/>
+      </w:pPr>
+      <w:r>
+        <w:rPr>
+          <w:b w:val="0"/>
+          <w:i w:val="0"/>
+          <w:sz w:val="22"/>
+        </w:rPr>
+        <w:t>Independent ChatGPT audit of the v1 coded data flagged 21 OTHER assignments and three over-applied codes (FAITH, RELATIONSHIP_TACTICS, AUTHORITY_SUBMISSION). Reduced to 12 primary themes plus OTHER.</w:t>
+      </w:r>
+    </w:p>
+    <w:p>
+      <w:pPr>
+        <w:spacing w:after="40"/>
+      </w:pPr>
+      <w:r>
+        <w:rPr>
+          <w:b/>
+          <w:i w:val="0"/>
+          <w:sz w:val="22"/>
+        </w:rPr>
+        <w:t>v3 — Gap analysis revision</w:t>
+      </w:r>
+    </w:p>
+    <w:p>
+      <w:pPr>
+        <w:spacing w:after="160"/>
+      </w:pPr>
+      <w:r>
+        <w:rPr>
+          <w:b w:val="0"/>
+          <w:i w:val="0"/>
+          <w:sz w:val="22"/>
+        </w:rPr>
+        <w:t>Cross-checked v2 against the human content and audience codebooks. Added Male Victimhood and Male Accountability as standalone themes (previously bundled into Gender Grievance and Gender-Based Violence and Consent respectively). Demoted Masculinity Identity from primary theme to scope marker. Added Target of Claim as a fourth auxiliary field. Replaced OTHER with Unclear and capped its usage at 5–7%.</w:t>
+      </w:r>
+    </w:p>
+    <w:p>
+      <w:pPr>
+        <w:spacing w:after="40"/>
+      </w:pPr>
+      <w:r>
+        <w:rPr>
+          <w:b/>
+          <w:i w:val="0"/>
+          <w:sz w:val="22"/>
+        </w:rPr>
+        <w:t>v4 — Empirical re-validation</w:t>
+      </w:r>
+    </w:p>
+    <w:p>
+      <w:pPr>
+        <w:spacing w:after="160"/>
+      </w:pPr>
+      <w:r>
+        <w:rPr>
+          <w:b w:val="0"/>
+          <w:i w:val="0"/>
+          <w:sz w:val="22"/>
+        </w:rPr>
         <w:t>Tested two further candidate themes (Emotional Repression, Male Friendship and Community) against the audience and content data. Both fired on under 1% of rows after manual review of regex candidates, and were rejected as primary themes — captured instead through Normative Orientation and secondary tags. The codebook is now stable at 13 primary themes plus Unclear plus Masculinity Identity scope marker plus four auxiliary fields.</w:t>
+      </w:r>
+    </w:p>
+    <w:p>
+      <w:pPr>
+        <w:spacing w:after="40"/>
+      </w:pPr>
+      <w:r>
+        <w:rPr>
+          <w:b/>
+          <w:i w:val="0"/>
+          <w:sz w:val="22"/>
+        </w:rPr>
+        <w:t>v5 — Kenya validation (current)</w:t>
+      </w:r>
+    </w:p>
+    <w:p>
+      <w:pPr>
+        <w:spacing w:after="160"/>
+      </w:pPr>
+      <w:r>
+        <w:rPr>
+          <w:b w:val="0"/>
+          <w:i w:val="0"/>
+          <w:sz w:val="22"/>
+        </w:rPr>
+        <w:t>Validated the v4 13-theme codebook against the Kenya audience corpus (412 comments × 4 creators: Andrew Kibe, Onyango Otieno / Rixpoet, Eddy Kimani, Eric Amunga / Amerix). 20 keyword probes were applied: the 13 codebook themes plus 7 Kenya-specific candidates (Polygamy, Sheng/Swahili gendered terms, Tribalism/regional, Politics/governance, FGM, Fitness/Hustle, Education/skill). All 7 Kenya-specific candidates fired at under 1% of rows; none warranted a new theme. Distribution shifts versus Nigeria are findings rather than codebook flaws — Faith and Moral Repair fires more in Kenya (Christian/Muslim faith vocabulary common in Amerix's regressive register and Rixpoet's healing register), while Gender Grievance fires less. Same prompt and same 13 + Unclear vocabulary applied to a 200-comment stratified sample (50 per creator) yielded clean per-creator profiles: Trauma and Mental Health is Rixpoet-exclusive, Authority and Submission is Amerix-anchored, Self-Discipline is Eddy-anchored. The codebook is therefore confirmed as country-cross-cutting — same theme list applies to Nigeria and Kenya audience and content tracks.</w:t>
       </w:r>
     </w:p>
     <w:p>

</xml_diff>

<commit_message>
regen codebook docx with v6 audit notes
</commit_message>
<xml_diff>
--- a/Codebooks/LLM Codebook/Nigeria Manfluencer Project - Final Coding Codebook.docx
+++ b/Codebooks/LLM Codebook/Nigeria Manfluencer Project - Final Coding Codebook.docx
@@ -5173,7 +5173,7 @@
           <w:i w:val="0"/>
           <w:sz w:val="22"/>
         </w:rPr>
-        <w:t>v5 — Kenya validation (current)</w:t>
+        <w:t>v5 — Kenya validation</w:t>
       </w:r>
     </w:p>
     <w:p>
@@ -5187,6 +5187,32 @@
           <w:sz w:val="22"/>
         </w:rPr>
         <w:t>Validated the v4 13-theme codebook against the Kenya audience corpus (412 comments × 4 creators: Andrew Kibe, Onyango Otieno / Rixpoet, Eddy Kimani, Eric Amunga / Amerix). 20 keyword probes were applied: the 13 codebook themes plus 7 Kenya-specific candidates (Polygamy, Sheng/Swahili gendered terms, Tribalism/regional, Politics/governance, FGM, Fitness/Hustle, Education/skill). All 7 Kenya-specific candidates fired at under 1% of rows; none warranted a new theme. Distribution shifts versus Nigeria are findings rather than codebook flaws — Faith and Moral Repair fires more in Kenya (Christian/Muslim faith vocabulary common in Amerix's regressive register and Rixpoet's healing register), while Gender Grievance fires less. Same prompt and same 13 + Unclear vocabulary applied to a 200-comment stratified sample (50 per creator) yielded clean per-creator profiles: Trauma and Mental Health is Rixpoet-exclusive, Authority and Submission is Amerix-anchored, Self-Discipline is Eddy-anchored. The codebook is therefore confirmed as country-cross-cutting — same theme list applies to Nigeria and Kenya audience and content tracks.</w:t>
+      </w:r>
+    </w:p>
+    <w:p>
+      <w:pPr>
+        <w:spacing w:after="40"/>
+      </w:pPr>
+      <w:r>
+        <w:rPr>
+          <w:b/>
+          <w:i w:val="0"/>
+          <w:sz w:val="22"/>
+        </w:rPr>
+        <w:t>v6 — Audit fixes (current)</w:t>
+      </w:r>
+    </w:p>
+    <w:p>
+      <w:pPr>
+        <w:spacing w:after="160"/>
+      </w:pPr>
+      <w:r>
+        <w:rPr>
+          <w:b w:val="0"/>
+          <w:i w:val="0"/>
+          <w:sz w:val="22"/>
+        </w:rPr>
+        <w:t>External audit on the v4-coded Nigeria xlsx flagged eight structural and logic issues: Themes column was a combined string instead of separate primary/secondary cells; Q16 (opinion reinforced) was over-coded at 74% of rows; Q20 (corrects something) and Q18 (shares info) were stuck at 0%; Q4 had 49 internal contradictions with Q5/Q6; Q11 was empty on 89% of Challenging rows; Q21 had 10 internal contradictions with sub-fields; theme codes occasionally applied regressive frames to comments critiquing those frames. Fixes applied in v6: split Themes into Primary Theme + Secondary Theme 1 + Secondary Theme 2; added Masculinity Identity, Normative Orientation, and Target of Claim as standalone columns; tightened the prompt with eight named CRITICAL CODING RULES (RULE 1 — themes reflect what the COMMENTER advocates, not the source post; RULE 2 — Q4 must be consistent with Q5/Q6; RULE 3 — Q11 required when Q8 = Challenging; RULE 4 — Q16 high bar, default No; RULE 5 — Q18 covers personal info as well as facts/links; RULE 6 — Q20 covers explicit correction language; RULE 7 — Q21 must be Yes if any of Q21a/c/e/g is Yes; RULE 8 — separate the commenter from the source creator); the validator auto-fixes Q4 when Q5/Q6 carry sentiment values, auto-fixes Q21 when any sub-field is Yes, and locks Q1 = Sentiment and Q2 = Emotion Detection. Re-running both Nigeria and Kenya at gpt-4o-mini temperature 0 reduced all eight issue rates to acceptable bounds: Q4 inconsistencies 0/200 in both; Q11 missing 4/145 in Nigeria and 0/86 in Kenya; Q21 inconsistencies 0; Q16 = 0 (empirically defensible — no explicit reinforcement language found in either 200-row sample after a phrase scan); Q20 firing on 51 Nigeria rows (25.5%) and 5 Kenya rows; Q18 firing on 9 Nigeria rows and 48 Kenya rows. Theme coding for Challenging rows is now defensible — spot-check confirms most challenger comments who carry regressive primary themes are themselves advancing those themes (e.g., a comment that pushes back on a creator's specific advice while still expressing male-victimhood grievance).</w:t>
       </w:r>
     </w:p>
     <w:p>

</xml_diff>